<commit_message>
Blog FR PDME: add the >100k-inhabitants criterion, align template, add PDME keywords
service-public lists employers with 50+ staff on a site in an agglomeration of
more than 100,000 inhabitants as subject to the plan, in addition to the
no-agreement route of L1214-8-2 II bis. Article, FAQ schema and the .docx/.pdf
template now state both routes.

Co-Authored-By: Claude Sonnet 5.5 <noreply@anthropic.com>
Claude-Session: https://claude.ai/code/session_01SnZwcAyZ1tX2u9igkeZ2Hp
</commit_message>
<xml_diff>
--- a/static/downloads/modele-plan-de-mobilite-employeur-teamwheels.docx
+++ b/static/downloads/modele-plan-de-mobilite-employeur-teamwheels.docx
@@ -214,7 +214,7 @@
           </w:tcPr>
           <w:p>
             <w:r>
-              <w:t>☐ Défaut d'accord à la NAO mobilité (art. L1214-8-2 II bis)   ☐ Démarche volontaire</w:t>
+              <w:t>☐ Agglomération &gt; 100 000 hab.   ☐ Défaut d'accord à la NAO mobilité (art. L1214-8-2 II bis)   ☐ Démarche volontaire</w:t>
             </w:r>
           </w:p>
         </w:tc>
@@ -239,7 +239,7 @@
     </w:p>
     <w:p>
       <w:r>
-        <w:t>Ce plan est établi au titre de l'article L1214-8-2 du Code des transports : à défaut d'accord sur les mesures visant à améliorer la mobilité des salariés entre leur résidence habituelle et leur lieu de travail (négociation prévue à l'article L2242-17 du Code du travail), les entreprises dont au moins cinquante salariés sont employés sur un même site élaborent un plan de mobilité employeur. Il est transmis à l'autorité organisatrice de la mobilité compétente.</w:t>
+        <w:t>Ce plan est établi au titre de l'article L1214-8-2 du Code des transports. Il s'impose aux employeurs d'au moins cinquante salariés sur un même site situés dans une agglomération de plus de 100 000 habitants (critère indiqué par service-public.fr, à confirmer auprès de votre autorité organisatrice) et, plus généralement, à défaut d'accord sur les mesures visant à améliorer la mobilité des salariés entre leur résidence habituelle et leur lieu de travail (négociation prévue à l'article L2242-17 du Code du travail). Il est transmis à l'autorité organisatrice de la mobilité compétente.</w:t>
       </w:r>
     </w:p>
     <w:p>
@@ -249,7 +249,7 @@
           <w:color w:val="666666"/>
           <w:sz w:val="19"/>
         </w:rPr>
-        <w:t>Consigne : si un accord NAO mobilité a été conclu, le plan n'est pas obligatoire, mais peut servir de document d'application de l'accord. Indiquez ici la référence de l'accord ou de la décision unilatérale.</w:t>
+        <w:t>Consigne : si un accord NAO mobilité a été conclu, la voie « défaut d'accord » ne s'applique pas ; le plan peut toutefois rester exigé en agglomération de plus de 100 000 habitants, et peut servir de document d'application de l'accord. Indiquez ici la référence de l'accord ou de la décision unilatérale.</w:t>
       </w:r>
     </w:p>
     <w:p>

</xml_diff>